<commit_message>
Handbook: warn to do the org transfer only at launch (with DNS cutover) so the site URL never breaks unexpectedly
</commit_message>
<xml_diff>
--- a/docs/Owner-and-Steward-Handbook.docx
+++ b/docs/Owner-and-Steward-Handbook.docx
@@ -2079,6 +2079,99 @@
     </w:p>
     <w:p>
       <w:pPr>
+        <w:pStyle w:val="BlockText"/>
+      </w:pPr>
+      <w:r>
+        <w:rPr>
+          <w:b/>
+          <w:bCs/>
+        </w:rPr>
+        <w:t xml:space="preserve">⚠️ Important — do the org transfer only at launch.</w:t>
+      </w:r>
+      <w:r>
+        <w:t xml:space="preserve"> </w:t>
+      </w:r>
+      <w:r>
+        <w:t xml:space="preserve">Moving the repository to the</w:t>
+      </w:r>
+      <w:r>
+        <w:t xml:space="preserve"> </w:t>
+      </w:r>
+      <w:r>
+        <w:rPr>
+          <w:rStyle w:val="VerbatimChar"/>
+        </w:rPr>
+        <w:t xml:space="preserve">uuwellesleyhills</w:t>
+      </w:r>
+      <w:r>
+        <w:t xml:space="preserve"> </w:t>
+      </w:r>
+      <w:r>
+        <w:t xml:space="preserve">organization</w:t>
+      </w:r>
+      <w:r>
+        <w:t xml:space="preserve"> </w:t>
+      </w:r>
+      <w:r>
+        <w:rPr>
+          <w:b/>
+          <w:bCs/>
+        </w:rPr>
+        <w:t xml:space="preserve">changes the site’s web address</w:t>
+      </w:r>
+      <w:r>
+        <w:t xml:space="preserve">, and GitHub does</w:t>
+      </w:r>
+      <w:r>
+        <w:t xml:space="preserve"> </w:t>
+      </w:r>
+      <w:r>
+        <w:rPr>
+          <w:b/>
+          <w:bCs/>
+        </w:rPr>
+        <w:t xml:space="preserve">not</w:t>
+      </w:r>
+      <w:r>
+        <w:t xml:space="preserve"> </w:t>
+      </w:r>
+      <w:r>
+        <w:t xml:space="preserve">redirect the old address (the old link goes dead). So transfer the repo</w:t>
+      </w:r>
+      <w:r>
+        <w:t xml:space="preserve"> </w:t>
+      </w:r>
+      <w:r>
+        <w:rPr>
+          <w:b/>
+          <w:bCs/>
+        </w:rPr>
+        <w:t xml:space="preserve">once, together with the domain (DNS) cutover</w:t>
+      </w:r>
+      <w:r>
+        <w:t xml:space="preserve"> </w:t>
+      </w:r>
+      <w:r>
+        <w:t xml:space="preserve">— not before. Until launch, the site stays under the</w:t>
+      </w:r>
+      <w:r>
+        <w:t xml:space="preserve"> </w:t>
+      </w:r>
+      <w:r>
+        <w:rPr>
+          <w:rStyle w:val="VerbatimChar"/>
+        </w:rPr>
+        <w:t xml:space="preserve">shudocan</w:t>
+      </w:r>
+      <w:r>
+        <w:t xml:space="preserve"> </w:t>
+      </w:r>
+      <w:r>
+        <w:t xml:space="preserve">account and its current address keeps working. The org can sit empty and ready in the meantime.</w:t>
+      </w:r>
+    </w:p>
+    <w:p>
+      <w:pPr>
         <w:pStyle w:val="Compact"/>
         <w:numPr>
           <w:ilvl w:val="0"/>
@@ -2105,6 +2198,16 @@
       <w:r>
         <w:t xml:space="preserve">(github.com/account/organizations/new → Free plan).</w:t>
       </w:r>
+      <w:r>
+        <w:t xml:space="preserve"> </w:t>
+      </w:r>
+      <w:r>
+        <w:rPr>
+          <w:i/>
+          <w:iCs/>
+        </w:rPr>
+        <w:t xml:space="preserve">(Already done — it exists, empty, ready for launch.)</w:t>
+      </w:r>
     </w:p>
     <w:p>
       <w:pPr>
@@ -2115,7 +2218,33 @@
         </w:numPr>
       </w:pPr>
       <w:r>
-        <w:t xml:space="preserve">Transfer the repository into the org (the current owner can do this in seconds).</w:t>
+        <w:rPr>
+          <w:b/>
+          <w:bCs/>
+        </w:rPr>
+        <w:t xml:space="preserve">At launch (with the DNS cutover):</w:t>
+      </w:r>
+      <w:r>
+        <w:t xml:space="preserve"> </w:t>
+      </w:r>
+      <w:r>
+        <w:t xml:space="preserve">transfer the repository into the org (the current owner can do this in seconds), then re-enable</w:t>
+      </w:r>
+      <w:r>
+        <w:t xml:space="preserve"> </w:t>
+      </w:r>
+      <w:r>
+        <w:rPr>
+          <w:b/>
+          <w:bCs/>
+        </w:rPr>
+        <w:t xml:space="preserve">GitHub Pages</w:t>
+      </w:r>
+      <w:r>
+        <w:t xml:space="preserve"> </w:t>
+      </w:r>
+      <w:r>
+        <w:t xml:space="preserve">under the org. Doing both at once means the address changes only a single time.</w:t>
       </w:r>
     </w:p>
     <w:p>
@@ -2127,23 +2256,60 @@
         </w:numPr>
       </w:pPr>
       <w:r>
-        <w:t xml:space="preserve">Re-enable</w:t>
-      </w:r>
-      <w:r>
-        <w:t xml:space="preserve"> </w:t>
-      </w:r>
-      <w:r>
-        <w:rPr>
-          <w:b/>
-          <w:bCs/>
-        </w:rPr>
-        <w:t xml:space="preserve">GitHub Pages</w:t>
-      </w:r>
-      <w:r>
-        <w:t xml:space="preserve"> </w:t>
-      </w:r>
-      <w:r>
-        <w:t xml:space="preserve">under the org.</w:t>
+        <w:t xml:space="preserve">After the transfer:</w:t>
+      </w:r>
+      <w:r>
+        <w:t xml:space="preserve"> </w:t>
+      </w:r>
+      <w:r>
+        <w:rPr>
+          <w:b/>
+          <w:bCs/>
+        </w:rPr>
+        <w:t xml:space="preserve">re-issue editor access codes</w:t>
+      </w:r>
+      <w:r>
+        <w:t xml:space="preserve"> </w:t>
+      </w:r>
+      <w:r>
+        <w:t xml:space="preserve">under the org (Resource owner =</w:t>
+      </w:r>
+      <w:r>
+        <w:t xml:space="preserve"> </w:t>
+      </w:r>
+      <w:r>
+        <w:rPr>
+          <w:rStyle w:val="VerbatimChar"/>
+        </w:rPr>
+        <w:t xml:space="preserve">uuwellesleyhills</w:t>
+      </w:r>
+      <w:r>
+        <w:t xml:space="preserve">), confirm the org</w:t>
+      </w:r>
+      <w:r>
+        <w:t xml:space="preserve"> </w:t>
+      </w:r>
+      <w:r>
+        <w:rPr>
+          <w:b/>
+          <w:bCs/>
+        </w:rPr>
+        <w:t xml:space="preserve">allows fine-grained tokens</w:t>
+      </w:r>
+      <w:r>
+        <w:t xml:space="preserve">, and have editors sign in with account</w:t>
+      </w:r>
+      <w:r>
+        <w:t xml:space="preserve"> </w:t>
+      </w:r>
+      <w:r>
+        <w:rPr>
+          <w:rStyle w:val="VerbatimChar"/>
+        </w:rPr>
+        <w:t xml:space="preserve">uuwellesleyhills</w:t>
+      </w:r>
+      <w:r>
+        <w:t xml:space="preserve">.</w:t>
       </w:r>
     </w:p>
     <w:p>

</xml_diff>